<commit_message>
docs: add busy request guide
</commit_message>
<xml_diff>
--- a/public/guides/huong-dan-cau-hinh-tag-lot.docx
+++ b/public/guides/huong-dan-cau-hinh-tag-lot.docx
@@ -147,6 +147,7 @@
     </w:p>
     <w:tbl>
       <w:tblPr>
+        <w:tblStyle w:val="TableGrid"/>
         <w:tblW w:type="dxa" w:w="9360"/>
         <w:jc w:val="left"/>
         <w:tblLayout w:type="fixed"/>
@@ -177,7 +178,7 @@
               <w:end w:w="130" w:type="dxa"/>
             </w:tcMar>
             <w:vAlign w:val="center"/>
-            <w:shd w:fill="9F1118"/>
+            <w:shd w:fill="D71920"/>
           </w:tcPr>
           <w:p>
             <w:pPr>
@@ -204,7 +205,7 @@
               <w:end w:w="130" w:type="dxa"/>
             </w:tcMar>
             <w:vAlign w:val="center"/>
-            <w:shd w:fill="9F1118"/>
+            <w:shd w:fill="D71920"/>
           </w:tcPr>
           <w:p>
             <w:pPr>
@@ -231,7 +232,7 @@
               <w:end w:w="130" w:type="dxa"/>
             </w:tcMar>
             <w:vAlign w:val="center"/>
-            <w:shd w:fill="9F1118"/>
+            <w:shd w:fill="D71920"/>
           </w:tcPr>
           <w:p>
             <w:pPr>
@@ -253,6 +254,7 @@
         <w:tc>
           <w:tcPr>
             <w:tcW w:type="dxa" w:w="1900"/>
+            <w:shd w:fill="FFFFFF"/>
           </w:tcPr>
           <w:p>
             <w:pPr>
@@ -272,6 +274,7 @@
         <w:tc>
           <w:tcPr>
             <w:tcW w:type="dxa" w:w="3730"/>
+            <w:shd w:fill="FFFFFF"/>
           </w:tcPr>
           <w:p>
             <w:pPr>
@@ -291,6 +294,7 @@
         <w:tc>
           <w:tcPr>
             <w:tcW w:type="dxa" w:w="3730"/>
+            <w:shd w:fill="FFFFFF"/>
           </w:tcPr>
           <w:p>
             <w:pPr>
@@ -312,6 +316,7 @@
         <w:tc>
           <w:tcPr>
             <w:tcW w:type="dxa" w:w="1900"/>
+            <w:shd w:fill="FFFFFF"/>
           </w:tcPr>
           <w:p>
             <w:pPr>
@@ -331,6 +336,7 @@
         <w:tc>
           <w:tcPr>
             <w:tcW w:type="dxa" w:w="3730"/>
+            <w:shd w:fill="FFFFFF"/>
           </w:tcPr>
           <w:p>
             <w:pPr>
@@ -350,6 +356,7 @@
         <w:tc>
           <w:tcPr>
             <w:tcW w:type="dxa" w:w="3730"/>
+            <w:shd w:fill="FFFFFF"/>
           </w:tcPr>
           <w:p>
             <w:pPr>
@@ -371,6 +378,7 @@
         <w:tc>
           <w:tcPr>
             <w:tcW w:type="dxa" w:w="1900"/>
+            <w:shd w:fill="FFFFFF"/>
           </w:tcPr>
           <w:p>
             <w:pPr>
@@ -390,6 +398,7 @@
         <w:tc>
           <w:tcPr>
             <w:tcW w:type="dxa" w:w="3730"/>
+            <w:shd w:fill="FFFFFF"/>
           </w:tcPr>
           <w:p>
             <w:pPr>
@@ -409,6 +418,7 @@
         <w:tc>
           <w:tcPr>
             <w:tcW w:type="dxa" w:w="3730"/>
+            <w:shd w:fill="FFFFFF"/>
           </w:tcPr>
           <w:p>
             <w:pPr>
@@ -430,6 +440,7 @@
         <w:tc>
           <w:tcPr>
             <w:tcW w:type="dxa" w:w="1900"/>
+            <w:shd w:fill="FFFFFF"/>
           </w:tcPr>
           <w:p>
             <w:pPr>
@@ -449,6 +460,7 @@
         <w:tc>
           <w:tcPr>
             <w:tcW w:type="dxa" w:w="3730"/>
+            <w:shd w:fill="FFFFFF"/>
           </w:tcPr>
           <w:p>
             <w:pPr>
@@ -468,6 +480,7 @@
         <w:tc>
           <w:tcPr>
             <w:tcW w:type="dxa" w:w="3730"/>
+            <w:shd w:fill="FFFFFF"/>
           </w:tcPr>
           <w:p>
             <w:pPr>
@@ -481,6 +494,118 @@
                 <w:sz w:val="20"/>
               </w:rPr>
               <w:t>Vào popup, bấm Xếp theo tag, kiểm tra danh sách rồi Chụp lốt.</w:t>
+            </w:r>
+          </w:p>
+        </w:tc>
+      </w:tr>
+      <w:tr>
+        <w:tc>
+          <w:tcPr>
+            <w:tcW w:type="dxa" w:w="1900"/>
+            <w:shd w:fill="FFFFFF"/>
+          </w:tcPr>
+          <w:p>
+            <w:pPr>
+              <w:spacing w:after="0"/>
+            </w:pPr>
+            <w:r/>
+            <w:r>
+              <w:rPr>
+                <w:b w:val="0"/>
+              </w:rPr>
+              <w:t>Gửi phiếu bận</w:t>
+            </w:r>
+          </w:p>
+        </w:tc>
+        <w:tc>
+          <w:tcPr>
+            <w:tcW w:type="dxa" w:w="3730"/>
+            <w:shd w:fill="FFFFFF"/>
+          </w:tcPr>
+          <w:p>
+            <w:pPr>
+              <w:spacing w:after="0"/>
+            </w:pPr>
+            <w:r/>
+            <w:r>
+              <w:rPr>
+                <w:b w:val="0"/>
+              </w:rPr>
+              <w:t>Công cụ &gt; Đơn xin bận</w:t>
+            </w:r>
+          </w:p>
+        </w:tc>
+        <w:tc>
+          <w:tcPr>
+            <w:tcW w:type="dxa" w:w="3730"/>
+            <w:shd w:fill="FFFFFF"/>
+          </w:tcPr>
+          <w:p>
+            <w:pPr>
+              <w:spacing w:after="0"/>
+            </w:pPr>
+            <w:r/>
+            <w:r>
+              <w:rPr>
+                <w:b w:val="0"/>
+              </w:rPr>
+              <w:t>Bấm Tạo đơn, chọn ngày/xe/tag, nhập lý do rồi gửi.</w:t>
+            </w:r>
+          </w:p>
+        </w:tc>
+      </w:tr>
+      <w:tr>
+        <w:tc>
+          <w:tcPr>
+            <w:tcW w:type="dxa" w:w="1900"/>
+            <w:shd w:fill="FFFFFF"/>
+          </w:tcPr>
+          <w:p>
+            <w:pPr>
+              <w:spacing w:after="0"/>
+            </w:pPr>
+            <w:r/>
+            <w:r>
+              <w:rPr>
+                <w:b w:val="0"/>
+              </w:rPr>
+              <w:t>Duyệt phiếu bận</w:t>
+            </w:r>
+          </w:p>
+        </w:tc>
+        <w:tc>
+          <w:tcPr>
+            <w:tcW w:type="dxa" w:w="3730"/>
+            <w:shd w:fill="FFFFFF"/>
+          </w:tcPr>
+          <w:p>
+            <w:pPr>
+              <w:spacing w:after="0"/>
+            </w:pPr>
+            <w:r/>
+            <w:r>
+              <w:rPr>
+                <w:b w:val="0"/>
+              </w:rPr>
+              <w:t>Công cụ &gt; Đơn xin bận</w:t>
+            </w:r>
+          </w:p>
+        </w:tc>
+        <w:tc>
+          <w:tcPr>
+            <w:tcW w:type="dxa" w:w="3730"/>
+            <w:shd w:fill="FFFFFF"/>
+          </w:tcPr>
+          <w:p>
+            <w:pPr>
+              <w:spacing w:after="0"/>
+            </w:pPr>
+            <w:r/>
+            <w:r>
+              <w:rPr>
+                <w:b w:val="0"/>
+              </w:rPr>
+              <w:t>Lọc Chờ duyệt, kiểm tra thông tin rồi Duyệt hoặc Từ chối.</w:t>
             </w:r>
           </w:p>
         </w:tc>
@@ -918,6 +1043,341 @@
     </w:p>
     <w:p>
       <w:pPr>
+        <w:pStyle w:val="Heading1"/>
+      </w:pPr>
+      <w:r>
+        <w:rPr>
+          <w:color w:val="D71920"/>
+        </w:rPr>
+        <w:t>6. Gửi và duyệt phiếu bận</w:t>
+      </w:r>
+    </w:p>
+    <w:p>
+      <w:pPr>
+        <w:spacing w:after="160"/>
+      </w:pPr>
+      <w:r>
+        <w:t>Phiếu bận là phần tài xế hoặc điều phối gửi yêu cầu xe bận theo ngày. Trên menu hệ thống đang hiển thị là Đơn xin bận. Khi phiếu được duyệt, người xếp lốt biết xe đó đang theo tag/lý do bận để xử lý đúng trong danh sách lốt.</w:t>
+      </w:r>
+    </w:p>
+    <w:p>
+      <w:pPr>
+        <w:jc w:val="center"/>
+      </w:pPr>
+      <w:r>
+        <w:drawing>
+          <wp:inline xmlns:a="http://schemas.openxmlformats.org/drawingml/2006/main" xmlns:pic="http://schemas.openxmlformats.org/drawingml/2006/picture">
+            <wp:extent cx="6035040" cy="4295528"/>
+            <wp:docPr id="6" name="Picture 6"/>
+            <wp:cNvGraphicFramePr>
+              <a:graphicFrameLocks noChangeAspect="1"/>
+            </wp:cNvGraphicFramePr>
+            <a:graphic>
+              <a:graphicData uri="http://schemas.openxmlformats.org/drawingml/2006/picture">
+                <pic:pic>
+                  <pic:nvPicPr>
+                    <pic:cNvPr id="0" name="don-xin-ban-annotated.png"/>
+                    <pic:cNvPicPr/>
+                  </pic:nvPicPr>
+                  <pic:blipFill>
+                    <a:blip r:embed="rId15"/>
+                    <a:stretch>
+                      <a:fillRect/>
+                    </a:stretch>
+                  </pic:blipFill>
+                  <pic:spPr>
+                    <a:xfrm>
+                      <a:off x="0" y="0"/>
+                      <a:ext cx="6035040" cy="4295528"/>
+                    </a:xfrm>
+                    <a:prstGeom prst="rect"/>
+                  </pic:spPr>
+                </pic:pic>
+              </a:graphicData>
+            </a:graphic>
+          </wp:inline>
+        </w:drawing>
+      </w:r>
+    </w:p>
+    <w:p>
+      <w:pPr>
+        <w:jc w:val="center"/>
+      </w:pPr>
+      <w:r>
+        <w:rPr>
+          <w:i/>
+          <w:color w:val="4B5563"/>
+          <w:sz w:val="18"/>
+        </w:rPr>
+        <w:t>Đơn xin bận: tạo phiếu, lọc trạng thái và xử lý duyệt/từ chối</w:t>
+      </w:r>
+    </w:p>
+    <w:tbl>
+      <w:tblPr>
+        <w:tblStyle w:val="TableGrid"/>
+        <w:tblW w:type="auto" w:w="0"/>
+        <w:tblLook w:firstColumn="1" w:firstRow="1" w:lastColumn="0" w:lastRow="0" w:noHBand="0" w:noVBand="1" w:val="04A0"/>
+      </w:tblPr>
+      <w:tblGrid>
+        <w:gridCol w:w="4680"/>
+        <w:gridCol w:w="4680"/>
+      </w:tblGrid>
+      <w:tr>
+        <w:tc>
+          <w:tcPr>
+            <w:tcW w:type="dxa" w:w="4680"/>
+            <w:shd w:fill="D71920"/>
+          </w:tcPr>
+          <w:p>
+            <w:pPr>
+              <w:spacing w:after="0"/>
+            </w:pPr>
+            <w:r>
+              <w:rPr>
+                <w:b/>
+                <w:color w:val="FFFFFF"/>
+              </w:rPr>
+            </w:r>
+            <w:r>
+              <w:rPr>
+                <w:b/>
+                <w:color w:val="FFFFFF"/>
+              </w:rPr>
+              <w:t>Tình huống</w:t>
+            </w:r>
+          </w:p>
+        </w:tc>
+        <w:tc>
+          <w:tcPr>
+            <w:tcW w:type="dxa" w:w="4680"/>
+            <w:shd w:fill="D71920"/>
+          </w:tcPr>
+          <w:p>
+            <w:pPr>
+              <w:spacing w:after="0"/>
+            </w:pPr>
+            <w:r>
+              <w:rPr>
+                <w:b/>
+                <w:color w:val="FFFFFF"/>
+              </w:rPr>
+            </w:r>
+            <w:r>
+              <w:rPr>
+                <w:b/>
+                <w:color w:val="FFFFFF"/>
+              </w:rPr>
+              <w:t>Cách làm ngắn gọn</w:t>
+            </w:r>
+          </w:p>
+        </w:tc>
+      </w:tr>
+      <w:tr>
+        <w:tc>
+          <w:tcPr>
+            <w:tcW w:type="dxa" w:w="4680"/>
+            <w:shd w:fill="FFFFFF"/>
+          </w:tcPr>
+          <w:p>
+            <w:pPr>
+              <w:spacing w:after="0"/>
+            </w:pPr>
+            <w:r/>
+            <w:r>
+              <w:rPr>
+                <w:b/>
+              </w:rPr>
+              <w:t>Gửi phiếu bận</w:t>
+            </w:r>
+          </w:p>
+        </w:tc>
+        <w:tc>
+          <w:tcPr>
+            <w:tcW w:type="dxa" w:w="4680"/>
+            <w:shd w:fill="FFFFFF"/>
+          </w:tcPr>
+          <w:p>
+            <w:pPr>
+              <w:spacing w:after="0"/>
+            </w:pPr>
+            <w:r/>
+            <w:r>
+              <w:rPr>
+                <w:b w:val="0"/>
+              </w:rPr>
+              <w:t>Vào Công cụ &gt; Đơn xin bận, bấm Tạo đơn. Chọn ngày, xe, tag phù hợp và nhập lý do ngắn gọn, ví dụ: về sớm, sửa chữa, trực sản xuất.</w:t>
+            </w:r>
+          </w:p>
+        </w:tc>
+      </w:tr>
+      <w:tr>
+        <w:tc>
+          <w:tcPr>
+            <w:tcW w:type="dxa" w:w="4680"/>
+            <w:shd w:fill="FFFFFF"/>
+          </w:tcPr>
+          <w:p>
+            <w:pPr>
+              <w:spacing w:after="0"/>
+            </w:pPr>
+            <w:r/>
+            <w:r>
+              <w:rPr>
+                <w:b/>
+              </w:rPr>
+              <w:t>Kiểm tra trước khi gửi</w:t>
+            </w:r>
+          </w:p>
+        </w:tc>
+        <w:tc>
+          <w:tcPr>
+            <w:tcW w:type="dxa" w:w="4680"/>
+            <w:shd w:fill="FFFFFF"/>
+          </w:tcPr>
+          <w:p>
+            <w:pPr>
+              <w:spacing w:after="0"/>
+            </w:pPr>
+            <w:r/>
+            <w:r>
+              <w:rPr>
+                <w:b w:val="0"/>
+              </w:rPr>
+              <w:t>Xem lại ngày và xe. Nếu chọn sai ngày hoặc sai xe thì sửa ngay trong form, tránh để người duyệt phải hủy/từ chối.</w:t>
+            </w:r>
+          </w:p>
+        </w:tc>
+      </w:tr>
+      <w:tr>
+        <w:tc>
+          <w:tcPr>
+            <w:tcW w:type="dxa" w:w="4680"/>
+            <w:shd w:fill="FFFFFF"/>
+          </w:tcPr>
+          <w:p>
+            <w:pPr>
+              <w:spacing w:after="0"/>
+            </w:pPr>
+            <w:r/>
+            <w:r>
+              <w:rPr>
+                <w:b/>
+              </w:rPr>
+              <w:t>Duyệt phiếu</w:t>
+            </w:r>
+          </w:p>
+        </w:tc>
+        <w:tc>
+          <w:tcPr>
+            <w:tcW w:type="dxa" w:w="4680"/>
+            <w:shd w:fill="FFFFFF"/>
+          </w:tcPr>
+          <w:p>
+            <w:pPr>
+              <w:spacing w:after="0"/>
+            </w:pPr>
+            <w:r/>
+            <w:r>
+              <w:rPr>
+                <w:b w:val="0"/>
+              </w:rPr>
+              <w:t>Người có quyền duyệt mở tab Chờ duyệt, đọc lý do và kiểm tra tag. Nếu hợp lệ, bấm Duyệt để ghi nhận phiếu cho ngày đó.</w:t>
+            </w:r>
+          </w:p>
+        </w:tc>
+      </w:tr>
+      <w:tr>
+        <w:tc>
+          <w:tcPr>
+            <w:tcW w:type="dxa" w:w="4680"/>
+            <w:shd w:fill="FFFFFF"/>
+          </w:tcPr>
+          <w:p>
+            <w:pPr>
+              <w:spacing w:after="0"/>
+            </w:pPr>
+            <w:r/>
+            <w:r>
+              <w:rPr>
+                <w:b/>
+              </w:rPr>
+              <w:t>Từ chối hoặc hủy</w:t>
+            </w:r>
+          </w:p>
+        </w:tc>
+        <w:tc>
+          <w:tcPr>
+            <w:tcW w:type="dxa" w:w="4680"/>
+            <w:shd w:fill="FFFFFF"/>
+          </w:tcPr>
+          <w:p>
+            <w:pPr>
+              <w:spacing w:after="0"/>
+            </w:pPr>
+            <w:r/>
+            <w:r>
+              <w:rPr>
+                <w:b w:val="0"/>
+              </w:rPr>
+              <w:t>Nếu thông tin chưa đúng, bấm Từ chối và ghi lý do rõ ràng. Hủy chỉ dùng khi phiếu gửi nhầm hoặc không còn cần xử lý.</w:t>
+            </w:r>
+          </w:p>
+        </w:tc>
+      </w:tr>
+      <w:tr>
+        <w:tc>
+          <w:tcPr>
+            <w:tcW w:type="dxa" w:w="4680"/>
+            <w:shd w:fill="FFFFFF"/>
+          </w:tcPr>
+          <w:p>
+            <w:pPr>
+              <w:spacing w:after="0"/>
+            </w:pPr>
+            <w:r/>
+            <w:r>
+              <w:rPr>
+                <w:b/>
+              </w:rPr>
+              <w:t>Theo dõi sau duyệt</w:t>
+            </w:r>
+          </w:p>
+        </w:tc>
+        <w:tc>
+          <w:tcPr>
+            <w:tcW w:type="dxa" w:w="4680"/>
+            <w:shd w:fill="FFFFFF"/>
+          </w:tcPr>
+          <w:p>
+            <w:pPr>
+              <w:spacing w:after="0"/>
+            </w:pPr>
+            <w:r/>
+            <w:r>
+              <w:rPr>
+                <w:b w:val="0"/>
+              </w:rPr>
+              <w:t>Dùng các tab Chờ duyệt, Đã duyệt, Từ chối, Đã hủy và bộ chọn ngày để kiểm tra lại trạng thái phiếu.</w:t>
+            </w:r>
+          </w:p>
+        </w:tc>
+      </w:tr>
+    </w:tbl>
+    <w:p>
+      <w:pPr>
+        <w:spacing w:before="160" w:after="200"/>
+        <w:ind w:left="173"/>
+      </w:pPr>
+      <w:r>
+        <w:rPr>
+          <w:b/>
+          <w:color w:val="D71920"/>
+        </w:rPr>
+        <w:t>Lưu ý: phiếu bận không thay thế bước Chụp lốt. Sau khi các phiếu cần thiết đã được duyệt, quay lại Dashboard &gt; Chụp lốt, bấm Xếp theo tag và kiểm tra danh sách trước khi chụp.</w:t>
+      </w:r>
+    </w:p>
+    <w:p>
+      <w:pPr>
         <w:keepNext/>
         <w:spacing w:before="240" w:after="100"/>
       </w:pPr>
@@ -985,6 +1445,22 @@
           <w:sz w:val="21"/>
         </w:rPr>
         <w:t>Bấm Chụp lốt cuối cùng mới lưu snapshot và đồng bộ STT.</w:t>
+      </w:r>
+    </w:p>
+    <w:p>
+      <w:pPr>
+        <w:pStyle w:val="ListBullet"/>
+      </w:pPr>
+      <w:r>
+        <w:t>Phiếu bận được gửi ở Công cụ &gt; Đơn xin bận; người duyệt xử lý tại tab Chờ duyệt.</w:t>
+      </w:r>
+    </w:p>
+    <w:p>
+      <w:pPr>
+        <w:pStyle w:val="ListBullet"/>
+      </w:pPr>
+      <w:r>
+        <w:t>Duyệt phiếu bận xong vẫn phải vào Dashboard &gt; Chụp lốt để xếp/chụp danh sách lốt cuối cùng.</w:t>
       </w:r>
     </w:p>
     <w:sectPr>

</xml_diff>